<commit_message>
docs(report): correct LSTM best-epoch claim
The report stated the LSTM's lowest validation loss was at "epoch six",
but the training history (val_loss[0]=0.318, rising afterward) and the
Figure 7.1 chart annotation both show it is epoch one. Fixed the body
text and figure caption in three places; regenerated the PDF.

Co-Authored-By: Claude Opus 4.8 <noreply@anthropic.com>
</commit_message>
<xml_diff>
--- a/report/Spike-Sense_Project_Report.docx
+++ b/report/Spike-Sense_Project_Report.docx
@@ -3616,17 +3616,17 @@
           <w:i w:val="0"/>
           <w:sz w:val="24"/>
         </w:rPr>
-        <w:t>Figure 7.1  LSTM Autoencoder training and validation loss per epoch. The best validation loss is reached at epoch six, where early stopping halts training</w:t>
-      </w:r>
-      <w:r>
-        <w:rPr>
-          <w:rFonts w:ascii="Times New Roman" w:hAnsi="Times New Roman" w:cs="Times New Roman"/>
-          <w:b w:val="0"/>
-          <w:i w:val="0"/>
-          <w:sz w:val="24"/>
-        </w:rPr>
+        <w:t>Figure 7.1  LSTM Autoencoder training and validation loss per epoch. Training ran for six epochs under early stopping; the lowest validation loss occurs at the first epoch</w:t>
         <w:tab/>
         <w:t>65</w:t>
+      </w:r>
+      <w:r>
+        <w:rPr>
+          <w:rFonts w:ascii="Times New Roman" w:hAnsi="Times New Roman" w:cs="Times New Roman"/>
+          <w:b w:val="0"/>
+          <w:i w:val="0"/>
+          <w:sz w:val="24"/>
+        </w:rPr>
       </w:r>
     </w:p>
     <w:p>
@@ -16287,7 +16287,7 @@
           <w:i w:val="0"/>
           <w:sz w:val="24"/>
         </w:rPr>
-        <w:t>The LSTM Autoencoder was trained on 25,288 normal windows aggregated across the six series, with validation-based early stopping. Figure 7.1 plots training and validation loss. Training loss falls rapidly and the lowest validation loss is reached early, at the sixth epoch, after which early stopping prevents over-fitting. The small number of epochs reflects the regularity of normal cloud telemetry: the network learns to reconstruct ordinary behaviour quickly.</w:t>
+        <w:t>The LSTM Autoencoder was trained on 25,288 normal windows aggregated across the six series, with validation-based early stopping. Figure 7.1 plots training and validation loss. Training loss falls rapidly and the lowest validation loss is reached at the very first epoch, after which validation loss drifts upward; early stopping with patience runs training to six epochs in total and prevents over-fitting. The small number of epochs reflects the regularity of normal cloud telemetry: the network learns to reconstruct ordinary behaviour quickly.</w:t>
       </w:r>
     </w:p>
     <w:p>
@@ -16345,7 +16345,7 @@
           <w:i w:val="0"/>
           <w:sz w:val="20"/>
         </w:rPr>
-        <w:t xml:space="preserve">Figure 7.1: </w:t>
+        <w:t>Figure 7.1: LSTM Autoencoder training and validation loss per epoch. Training ran for six epochs under early stopping; the lowest validation loss occurs at the first epoch.</w:t>
       </w:r>
       <w:r>
         <w:rPr>
@@ -16354,7 +16354,6 @@
           <w:i/>
           <w:sz w:val="20"/>
         </w:rPr>
-        <w:t>LSTM Autoencoder training and validation loss per epoch. The best validation loss is reached at epoch six, where early stopping halts training.</w:t>
       </w:r>
     </w:p>
     <w:p>

</xml_diff>